<commit_message>
minor tidying up of  comments, help file
</commit_message>
<xml_diff>
--- a/BigIntCalculator/Modular square root.docx
+++ b/BigIntCalculator/Modular square root.docx
@@ -7,7 +7,17 @@
         <w:pStyle w:val="Heading1"/>
       </w:pPr>
       <w:r>
-        <w:t xml:space="preserve">Modular square root: find r such that </w:t>
+        <w:t xml:space="preserve">Modular square root: find </w:t>
+      </w:r>
+      <w:r>
+        <w:rPr>
+          <w:i/>
+          <w:iCs/>
+        </w:rPr>
+        <w:t>r</w:t>
+      </w:r>
+      <w:r>
+        <w:t xml:space="preserve"> such that </w:t>
       </w:r>
       <w:r>
         <w:rPr>
@@ -749,6 +759,10 @@
       <w:r>
         <w:rPr>
           <w:rFonts w:cstheme="minorHAnsi"/>
+          <w:b/>
+          <w:bCs/>
+          <w:i/>
+          <w:iCs/>
           <w:sz w:val="24"/>
           <w:szCs w:val="24"/>
         </w:rPr>
@@ -757,6 +771,10 @@
       <w:r>
         <w:rPr>
           <w:rFonts w:cstheme="minorHAnsi"/>
+          <w:b/>
+          <w:bCs/>
+          <w:i/>
+          <w:iCs/>
           <w:sz w:val="24"/>
           <w:szCs w:val="24"/>
         </w:rPr>
@@ -794,11 +812,23 @@
           <w:sz w:val="24"/>
           <w:szCs w:val="24"/>
         </w:rPr>
-        <w:t xml:space="preserve"> If there are multiple solutions: r</w:t>
-      </w:r>
-      <w:r>
-        <w:rPr>
-          <w:rFonts w:cstheme="minorHAnsi"/>
+        <w:t xml:space="preserve"> If there are multiple solutions: </w:t>
+      </w:r>
+      <w:r>
+        <w:rPr>
+          <w:rFonts w:cstheme="minorHAnsi"/>
+          <w:i/>
+          <w:iCs/>
+          <w:sz w:val="24"/>
+          <w:szCs w:val="24"/>
+        </w:rPr>
+        <w:t>r</w:t>
+      </w:r>
+      <w:r>
+        <w:rPr>
+          <w:rFonts w:cstheme="minorHAnsi"/>
+          <w:i/>
+          <w:iCs/>
           <w:sz w:val="24"/>
           <w:szCs w:val="24"/>
           <w:vertAlign w:val="subscript"/>
@@ -808,6 +838,8 @@
       <w:r>
         <w:rPr>
           <w:rFonts w:cstheme="minorHAnsi"/>
+          <w:i/>
+          <w:iCs/>
           <w:sz w:val="24"/>
           <w:szCs w:val="24"/>
         </w:rPr>
@@ -816,11 +848,22 @@
       <w:r>
         <w:rPr>
           <w:rFonts w:cstheme="minorHAnsi"/>
+          <w:i/>
+          <w:iCs/>
           <w:sz w:val="24"/>
           <w:szCs w:val="24"/>
           <w:vertAlign w:val="subscript"/>
         </w:rPr>
-        <w:t xml:space="preserve">2, </w:t>
+        <w:t>2,</w:t>
+      </w:r>
+      <w:r>
+        <w:rPr>
+          <w:rFonts w:cstheme="minorHAnsi"/>
+          <w:sz w:val="24"/>
+          <w:szCs w:val="24"/>
+          <w:vertAlign w:val="subscript"/>
+        </w:rPr>
+        <w:t xml:space="preserve"> </w:t>
       </w:r>
       <w:r>
         <w:rPr>
@@ -853,11 +896,23 @@
           <w:sz w:val="24"/>
           <w:szCs w:val="24"/>
         </w:rPr>
-        <w:t>then there is a corresponding solution –r</w:t>
-      </w:r>
-      <w:r>
-        <w:rPr>
-          <w:rFonts w:cstheme="minorHAnsi"/>
+        <w:t xml:space="preserve">then there is a corresponding solution </w:t>
+      </w:r>
+      <w:r>
+        <w:rPr>
+          <w:rFonts w:cstheme="minorHAnsi"/>
+          <w:i/>
+          <w:iCs/>
+          <w:sz w:val="24"/>
+          <w:szCs w:val="24"/>
+        </w:rPr>
+        <w:t>–r</w:t>
+      </w:r>
+      <w:r>
+        <w:rPr>
+          <w:rFonts w:cstheme="minorHAnsi"/>
+          <w:i/>
+          <w:iCs/>
           <w:sz w:val="24"/>
           <w:szCs w:val="24"/>
           <w:vertAlign w:val="subscript"/>
@@ -867,6 +922,8 @@
       <w:r>
         <w:rPr>
           <w:rFonts w:cstheme="minorHAnsi"/>
+          <w:i/>
+          <w:iCs/>
           <w:sz w:val="24"/>
           <w:szCs w:val="24"/>
         </w:rPr>
@@ -875,6 +932,8 @@
       <w:r>
         <w:rPr>
           <w:rFonts w:cstheme="minorHAnsi"/>
+          <w:i/>
+          <w:iCs/>
           <w:sz w:val="24"/>
           <w:szCs w:val="24"/>
           <w:vertAlign w:val="subscript"/>
@@ -8627,20 +8686,136 @@
         </w:rPr>
         <w:t xml:space="preserve">4 and 32 are not mutually prime so go to step 2(b). </w:t>
       </w:r>
+      <w:proofErr w:type="gramStart"/>
+      <w:r>
+        <w:rPr>
+          <w:rFonts w:cstheme="minorHAnsi"/>
+          <w:sz w:val="24"/>
+          <w:szCs w:val="24"/>
+        </w:rPr>
+        <w:t>gcd(</w:t>
+      </w:r>
+      <w:proofErr w:type="gramEnd"/>
+      <w:r>
+        <w:rPr>
+          <w:rFonts w:cstheme="minorHAnsi"/>
+          <w:sz w:val="24"/>
+          <w:szCs w:val="24"/>
+        </w:rPr>
+        <w:t>4, 32) = 4.</w:t>
+      </w:r>
+    </w:p>
+    <w:p>
+      <w:pPr>
+        <w:spacing w:after="0"/>
+        <w:rPr>
+          <w:rFonts w:cstheme="minorHAnsi"/>
+          <w:sz w:val="24"/>
+          <w:szCs w:val="24"/>
+        </w:rPr>
+      </w:pPr>
+      <w:r>
+        <w:rPr>
+          <w:rFonts w:cstheme="minorHAnsi"/>
+          <w:i/>
+          <w:sz w:val="24"/>
+          <w:szCs w:val="24"/>
+        </w:rPr>
+        <w:t xml:space="preserve">If solving by hand the following step would be skipped because 4/4 = 1. </w:t>
+      </w:r>
+      <w:r>
+        <w:rPr>
+          <w:rFonts w:cstheme="minorHAnsi"/>
+          <w:i/>
+          <w:sz w:val="24"/>
+          <w:szCs w:val="24"/>
+        </w:rPr>
+        <w:t>However,</w:t>
+      </w:r>
+      <w:r>
+        <w:rPr>
+          <w:rFonts w:cstheme="minorHAnsi"/>
+          <w:i/>
+          <w:sz w:val="24"/>
+          <w:szCs w:val="24"/>
+        </w:rPr>
+        <w:t xml:space="preserve"> the computer program proceeds as follows.</w:t>
+      </w:r>
+    </w:p>
+    <w:p>
+      <w:pPr>
+        <w:spacing w:after="0"/>
+        <w:rPr>
+          <w:sz w:val="24"/>
+          <w:szCs w:val="24"/>
+        </w:rPr>
+      </w:pPr>
+      <w:r>
+        <w:rPr>
+          <w:rFonts w:cstheme="minorHAnsi"/>
+          <w:sz w:val="24"/>
+          <w:szCs w:val="24"/>
+        </w:rPr>
+        <w:t xml:space="preserve">Use step 2(a) to solve </w:t>
+      </w:r>
+      <w:r>
+        <w:rPr>
+          <w:rFonts w:cstheme="minorHAnsi"/>
+          <w:b/>
+          <w:i/>
+          <w:sz w:val="24"/>
+          <w:szCs w:val="24"/>
+        </w:rPr>
+        <w:t>x</w:t>
+      </w:r>
+      <w:r>
+        <w:rPr>
+          <w:rFonts w:cstheme="minorHAnsi"/>
+          <w:b/>
+          <w:i/>
+          <w:sz w:val="24"/>
+          <w:szCs w:val="24"/>
+          <w:vertAlign w:val="superscript"/>
+        </w:rPr>
+        <w:t>2</w:t>
+      </w:r>
+      <w:r>
+        <w:rPr>
+          <w:rFonts w:cstheme="minorHAnsi"/>
+          <w:b/>
+          <w:i/>
+          <w:sz w:val="24"/>
+          <w:szCs w:val="24"/>
+        </w:rPr>
+        <w:t xml:space="preserve"> ≡ 1 (mod 32)</w:t>
+      </w:r>
+      <w:r>
+        <w:rPr>
+          <w:rFonts w:cstheme="minorHAnsi"/>
+          <w:sz w:val="24"/>
+          <w:szCs w:val="24"/>
+        </w:rPr>
+        <w:t xml:space="preserve"> </w:t>
+      </w:r>
+      <w:r>
+        <w:rPr>
+          <w:sz w:val="24"/>
+          <w:szCs w:val="24"/>
+        </w:rPr>
+        <w:br/>
+      </w:r>
       <w:proofErr w:type="spellStart"/>
       <w:proofErr w:type="gramStart"/>
       <w:r>
         <w:rPr>
-          <w:rFonts w:cstheme="minorHAnsi"/>
-          <w:sz w:val="24"/>
-          <w:szCs w:val="24"/>
-        </w:rPr>
-        <w:t>gcd</w:t>
+          <w:sz w:val="24"/>
+          <w:szCs w:val="24"/>
+        </w:rPr>
+        <w:t>modsqrt</w:t>
       </w:r>
       <w:proofErr w:type="spellEnd"/>
       <w:r>
         <w:rPr>
-          <w:rFonts w:cstheme="minorHAnsi"/>
           <w:sz w:val="24"/>
           <w:szCs w:val="24"/>
         </w:rPr>
@@ -8649,48 +8824,57 @@
       <w:proofErr w:type="gramEnd"/>
       <w:r>
         <w:rPr>
-          <w:rFonts w:cstheme="minorHAnsi"/>
-          <w:sz w:val="24"/>
-          <w:szCs w:val="24"/>
-        </w:rPr>
-        <w:t>4, 32) = 4.</w:t>
+          <w:sz w:val="24"/>
+          <w:szCs w:val="24"/>
+        </w:rPr>
+        <w:t>1, 32) = 1, 31, 15, 17,</w:t>
       </w:r>
     </w:p>
     <w:p>
       <w:pPr>
         <w:spacing w:after="0"/>
         <w:rPr>
-          <w:rFonts w:cstheme="minorHAnsi"/>
-          <w:sz w:val="24"/>
-          <w:szCs w:val="24"/>
-        </w:rPr>
-      </w:pPr>
-      <w:r>
-        <w:rPr>
-          <w:rFonts w:cstheme="minorHAnsi"/>
-          <w:i/>
-          <w:sz w:val="24"/>
-          <w:szCs w:val="24"/>
-        </w:rPr>
-        <w:t xml:space="preserve">If solving by hand the following step would be skipped because 4/4 = 1. </w:t>
-      </w:r>
-      <w:r>
-        <w:rPr>
-          <w:rFonts w:cstheme="minorHAnsi"/>
-          <w:i/>
-          <w:sz w:val="24"/>
-          <w:szCs w:val="24"/>
-        </w:rPr>
-        <w:t>However,</w:t>
-      </w:r>
-      <w:r>
-        <w:rPr>
-          <w:rFonts w:cstheme="minorHAnsi"/>
-          <w:i/>
-          <w:sz w:val="24"/>
-          <w:szCs w:val="24"/>
-        </w:rPr>
-        <w:t xml:space="preserve"> the computer program proceeds as follows.</w:t>
+          <w:sz w:val="24"/>
+          <w:szCs w:val="24"/>
+        </w:rPr>
+      </w:pPr>
+      <w:r>
+        <w:rPr>
+          <w:sz w:val="24"/>
+          <w:szCs w:val="24"/>
+        </w:rPr>
+        <w:t>We only need the 1</w:t>
+      </w:r>
+      <w:r>
+        <w:rPr>
+          <w:sz w:val="24"/>
+          <w:szCs w:val="24"/>
+          <w:vertAlign w:val="superscript"/>
+        </w:rPr>
+        <w:t>st</w:t>
+      </w:r>
+      <w:r>
+        <w:rPr>
+          <w:sz w:val="24"/>
+          <w:szCs w:val="24"/>
+        </w:rPr>
+        <w:t xml:space="preserve"> root </w:t>
+      </w:r>
+      <w:r>
+        <w:rPr>
+          <w:b/>
+          <w:i/>
+          <w:sz w:val="24"/>
+          <w:szCs w:val="24"/>
+        </w:rPr>
+        <w:t>r=1</w:t>
+      </w:r>
+      <w:r>
+        <w:rPr>
+          <w:sz w:val="24"/>
+          <w:szCs w:val="24"/>
+        </w:rPr>
+        <w:t>.</w:t>
       </w:r>
     </w:p>
     <w:p>
@@ -8701,13 +8885,36 @@
           <w:szCs w:val="24"/>
         </w:rPr>
       </w:pPr>
-      <w:r>
-        <w:rPr>
-          <w:rFonts w:cstheme="minorHAnsi"/>
-          <w:sz w:val="24"/>
-          <w:szCs w:val="24"/>
-        </w:rPr>
-        <w:t xml:space="preserve">Use step 2(a) to solve </w:t>
+    </w:p>
+    <w:p>
+      <w:pPr>
+        <w:spacing w:after="0"/>
+        <w:rPr>
+          <w:rFonts w:cstheme="minorHAnsi"/>
+          <w:sz w:val="24"/>
+          <w:szCs w:val="24"/>
+        </w:rPr>
+      </w:pPr>
+      <w:r>
+        <w:rPr>
+          <w:sz w:val="24"/>
+          <w:szCs w:val="24"/>
+        </w:rPr>
+        <w:t>Use step2</w:t>
+      </w:r>
+      <w:r>
+        <w:rPr>
+          <w:sz w:val="24"/>
+          <w:szCs w:val="24"/>
+        </w:rPr>
+        <w:t>(</w:t>
+      </w:r>
+      <w:r>
+        <w:rPr>
+          <w:sz w:val="24"/>
+          <w:szCs w:val="24"/>
+        </w:rPr>
+        <w:t xml:space="preserve">b)2 to solve </w:t>
       </w:r>
       <w:r>
         <w:rPr>
@@ -8738,7 +8945,181 @@
           <w:sz w:val="24"/>
           <w:szCs w:val="24"/>
         </w:rPr>
-        <w:t xml:space="preserve"> ≡ 1 (mod 32)</w:t>
+        <w:t xml:space="preserve"> ≡ 4 (mod 32)</w:t>
+      </w:r>
+    </w:p>
+    <w:p>
+      <w:pPr>
+        <w:spacing w:after="0"/>
+        <w:rPr>
+          <w:rFonts w:cstheme="minorHAnsi"/>
+          <w:sz w:val="24"/>
+          <w:szCs w:val="24"/>
+        </w:rPr>
+      </w:pPr>
+      <w:r>
+        <w:rPr>
+          <w:rFonts w:cstheme="minorHAnsi"/>
+          <w:sz w:val="24"/>
+          <w:szCs w:val="24"/>
+        </w:rPr>
+        <w:t xml:space="preserve">We have p=2, k=2, </w:t>
+      </w:r>
+      <w:proofErr w:type="spellStart"/>
+      <w:r>
+        <w:rPr>
+          <w:rFonts w:cstheme="minorHAnsi"/>
+          <w:sz w:val="24"/>
+          <w:szCs w:val="24"/>
+        </w:rPr>
+        <w:t>i</w:t>
+      </w:r>
+      <w:proofErr w:type="spellEnd"/>
+      <w:r>
+        <w:rPr>
+          <w:rFonts w:cstheme="minorHAnsi"/>
+          <w:sz w:val="24"/>
+          <w:szCs w:val="24"/>
+        </w:rPr>
+        <w:t xml:space="preserve">=5, so </w:t>
+      </w:r>
+      <w:r>
+        <w:rPr>
+          <w:rFonts w:cstheme="minorHAnsi"/>
+          <w:sz w:val="24"/>
+          <w:szCs w:val="24"/>
+        </w:rPr>
+        <w:t>common difference</w:t>
+      </w:r>
+      <w:r>
+        <w:rPr>
+          <w:rFonts w:cstheme="minorHAnsi"/>
+          <w:sz w:val="24"/>
+          <w:szCs w:val="24"/>
+        </w:rPr>
+        <w:t xml:space="preserve"> = 2</w:t>
+      </w:r>
+      <w:r>
+        <w:rPr>
+          <w:rFonts w:cstheme="minorHAnsi"/>
+          <w:sz w:val="24"/>
+          <w:szCs w:val="24"/>
+          <w:vertAlign w:val="superscript"/>
+        </w:rPr>
+        <w:t>3</w:t>
+      </w:r>
+      <w:r>
+        <w:rPr>
+          <w:rFonts w:cstheme="minorHAnsi"/>
+          <w:sz w:val="24"/>
+          <w:szCs w:val="24"/>
+        </w:rPr>
+        <w:t xml:space="preserve"> = 8.</w:t>
+      </w:r>
+    </w:p>
+    <w:p>
+      <w:pPr>
+        <w:spacing w:after="0"/>
+        <w:rPr>
+          <w:rFonts w:cstheme="minorHAnsi"/>
+          <w:sz w:val="24"/>
+          <w:szCs w:val="24"/>
+        </w:rPr>
+      </w:pPr>
+      <w:proofErr w:type="gramStart"/>
+      <w:r>
+        <w:rPr>
+          <w:rFonts w:cstheme="minorHAnsi"/>
+          <w:sz w:val="24"/>
+          <w:szCs w:val="24"/>
+        </w:rPr>
+        <w:t>So</w:t>
+      </w:r>
+      <w:proofErr w:type="gramEnd"/>
+      <w:r>
+        <w:rPr>
+          <w:rFonts w:cstheme="minorHAnsi"/>
+          <w:sz w:val="24"/>
+          <w:szCs w:val="24"/>
+        </w:rPr>
+        <w:t xml:space="preserve"> the 1</w:t>
+      </w:r>
+      <w:r>
+        <w:rPr>
+          <w:rFonts w:cstheme="minorHAnsi"/>
+          <w:sz w:val="24"/>
+          <w:szCs w:val="24"/>
+          <w:vertAlign w:val="superscript"/>
+        </w:rPr>
+        <w:t>st</w:t>
+      </w:r>
+      <w:r>
+        <w:rPr>
+          <w:rFonts w:cstheme="minorHAnsi"/>
+          <w:sz w:val="24"/>
+          <w:szCs w:val="24"/>
+        </w:rPr>
+        <w:t xml:space="preserve"> sequence of roots is 2, 10, 18, 26</w:t>
+      </w:r>
+    </w:p>
+    <w:p>
+      <w:pPr>
+        <w:spacing w:after="0"/>
+        <w:rPr>
+          <w:rFonts w:cstheme="minorHAnsi"/>
+          <w:sz w:val="24"/>
+          <w:szCs w:val="24"/>
+        </w:rPr>
+      </w:pPr>
+      <w:r>
+        <w:rPr>
+          <w:rFonts w:cstheme="minorHAnsi"/>
+          <w:sz w:val="24"/>
+          <w:szCs w:val="24"/>
+        </w:rPr>
+        <w:t>The second set of roots is 32-r</w:t>
+      </w:r>
+      <w:r>
+        <w:rPr>
+          <w:rFonts w:cstheme="minorHAnsi"/>
+          <w:sz w:val="24"/>
+          <w:szCs w:val="24"/>
+          <w:vertAlign w:val="subscript"/>
+        </w:rPr>
+        <w:t>1</w:t>
+      </w:r>
+      <w:r>
+        <w:rPr>
+          <w:rFonts w:cstheme="minorHAnsi"/>
+          <w:sz w:val="24"/>
+          <w:szCs w:val="24"/>
+        </w:rPr>
+        <w:t>, 32-r</w:t>
+      </w:r>
+      <w:r>
+        <w:rPr>
+          <w:rFonts w:cstheme="minorHAnsi"/>
+          <w:sz w:val="24"/>
+          <w:szCs w:val="24"/>
+          <w:vertAlign w:val="subscript"/>
+        </w:rPr>
+        <w:t>2</w:t>
+      </w:r>
+      <w:r>
+        <w:rPr>
+          <w:rFonts w:cstheme="minorHAnsi"/>
+          <w:sz w:val="24"/>
+          <w:szCs w:val="24"/>
+        </w:rPr>
+        <w:t>, …</w:t>
+      </w:r>
+      <w:r>
+        <w:rPr>
+          <w:rFonts w:cstheme="minorHAnsi"/>
+          <w:sz w:val="24"/>
+          <w:szCs w:val="24"/>
+        </w:rPr>
+        <w:t xml:space="preserve">etc. </w:t>
       </w:r>
       <w:r>
         <w:rPr>
@@ -8748,13 +9129,60 @@
         </w:rPr>
         <w:t xml:space="preserve"> </w:t>
       </w:r>
-      <w:r>
-        <w:rPr>
-          <w:sz w:val="24"/>
-          <w:szCs w:val="24"/>
-        </w:rPr>
-        <w:br/>
-      </w:r>
+      <w:proofErr w:type="gramStart"/>
+      <w:r>
+        <w:rPr>
+          <w:rFonts w:cstheme="minorHAnsi"/>
+          <w:sz w:val="24"/>
+          <w:szCs w:val="24"/>
+        </w:rPr>
+        <w:t>i.e.</w:t>
+      </w:r>
+      <w:proofErr w:type="gramEnd"/>
+      <w:r>
+        <w:rPr>
+          <w:rFonts w:cstheme="minorHAnsi"/>
+          <w:sz w:val="24"/>
+          <w:szCs w:val="24"/>
+        </w:rPr>
+        <w:t xml:space="preserve"> 30, 22, 14, 6.</w:t>
+      </w:r>
+    </w:p>
+    <w:p>
+      <w:pPr>
+        <w:spacing w:after="0"/>
+        <w:rPr>
+          <w:sz w:val="24"/>
+          <w:szCs w:val="24"/>
+        </w:rPr>
+      </w:pPr>
+      <w:proofErr w:type="gramStart"/>
+      <w:r>
+        <w:rPr>
+          <w:rFonts w:cstheme="minorHAnsi"/>
+          <w:sz w:val="24"/>
+          <w:szCs w:val="24"/>
+        </w:rPr>
+        <w:t>So</w:t>
+      </w:r>
+      <w:proofErr w:type="gramEnd"/>
+      <w:r>
+        <w:rPr>
+          <w:rFonts w:cstheme="minorHAnsi"/>
+          <w:sz w:val="24"/>
+          <w:szCs w:val="24"/>
+        </w:rPr>
+        <w:t xml:space="preserve"> we have:</w:t>
+      </w:r>
+    </w:p>
+    <w:p>
+      <w:pPr>
+        <w:spacing w:after="0"/>
+        <w:rPr>
+          <w:sz w:val="24"/>
+          <w:szCs w:val="24"/>
+        </w:rPr>
+      </w:pPr>
       <w:proofErr w:type="spellStart"/>
       <w:proofErr w:type="gramStart"/>
       <w:r>
@@ -8778,352 +9206,46 @@
           <w:sz w:val="24"/>
           <w:szCs w:val="24"/>
         </w:rPr>
-        <w:t>1, 32) = 1, 31, 15, 17,</w:t>
+        <w:t>4, 32) = 2, 30, 10, 22, 18, 14, 26, 6,</w:t>
       </w:r>
     </w:p>
     <w:p>
       <w:pPr>
         <w:spacing w:after="0"/>
         <w:rPr>
-          <w:sz w:val="24"/>
-          <w:szCs w:val="24"/>
-        </w:rPr>
-      </w:pPr>
-      <w:r>
-        <w:rPr>
-          <w:sz w:val="24"/>
-          <w:szCs w:val="24"/>
-        </w:rPr>
-        <w:t>We only need the 1</w:t>
-      </w:r>
-      <w:r>
-        <w:rPr>
-          <w:sz w:val="24"/>
-          <w:szCs w:val="24"/>
-          <w:vertAlign w:val="superscript"/>
-        </w:rPr>
-        <w:t>st</w:t>
-      </w:r>
-      <w:r>
-        <w:rPr>
-          <w:sz w:val="24"/>
-          <w:szCs w:val="24"/>
-        </w:rPr>
-        <w:t xml:space="preserve"> root </w:t>
-      </w:r>
-      <w:r>
-        <w:rPr>
-          <w:b/>
-          <w:i/>
-          <w:sz w:val="24"/>
-          <w:szCs w:val="24"/>
-        </w:rPr>
-        <w:t>r=1</w:t>
-      </w:r>
-      <w:r>
-        <w:rPr>
-          <w:sz w:val="24"/>
-          <w:szCs w:val="24"/>
-        </w:rPr>
-        <w:t>.</w:t>
-      </w:r>
-    </w:p>
-    <w:p>
-      <w:pPr>
-        <w:spacing w:after="0"/>
-        <w:rPr>
-          <w:sz w:val="24"/>
-          <w:szCs w:val="24"/>
-        </w:rPr>
-      </w:pPr>
-    </w:p>
-    <w:p>
-      <w:pPr>
-        <w:spacing w:after="0"/>
-        <w:rPr>
-          <w:rFonts w:cstheme="minorHAnsi"/>
-          <w:sz w:val="24"/>
-          <w:szCs w:val="24"/>
-        </w:rPr>
-      </w:pPr>
-      <w:r>
-        <w:rPr>
-          <w:sz w:val="24"/>
-          <w:szCs w:val="24"/>
-        </w:rPr>
-        <w:t>Use step2</w:t>
-      </w:r>
-      <w:r>
-        <w:rPr>
-          <w:sz w:val="24"/>
-          <w:szCs w:val="24"/>
-        </w:rPr>
-        <w:t>(</w:t>
-      </w:r>
-      <w:r>
-        <w:rPr>
-          <w:sz w:val="24"/>
-          <w:szCs w:val="24"/>
-        </w:rPr>
-        <w:t xml:space="preserve">b)2 to solve </w:t>
-      </w:r>
-      <w:r>
-        <w:rPr>
-          <w:rFonts w:cstheme="minorHAnsi"/>
-          <w:b/>
-          <w:i/>
-          <w:sz w:val="24"/>
-          <w:szCs w:val="24"/>
-        </w:rPr>
-        <w:t>x</w:t>
-      </w:r>
-      <w:r>
-        <w:rPr>
-          <w:rFonts w:cstheme="minorHAnsi"/>
-          <w:b/>
-          <w:i/>
-          <w:sz w:val="24"/>
-          <w:szCs w:val="24"/>
-          <w:vertAlign w:val="superscript"/>
-        </w:rPr>
-        <w:t>2</w:t>
-      </w:r>
-      <w:r>
-        <w:rPr>
-          <w:rFonts w:cstheme="minorHAnsi"/>
-          <w:b/>
-          <w:i/>
-          <w:sz w:val="24"/>
-          <w:szCs w:val="24"/>
-        </w:rPr>
-        <w:t xml:space="preserve"> ≡ 4 (mod 32)</w:t>
-      </w:r>
-    </w:p>
-    <w:p>
-      <w:pPr>
-        <w:spacing w:after="0"/>
-        <w:rPr>
-          <w:rFonts w:cstheme="minorHAnsi"/>
-          <w:sz w:val="24"/>
-          <w:szCs w:val="24"/>
-        </w:rPr>
-      </w:pPr>
-      <w:r>
-        <w:rPr>
-          <w:rFonts w:cstheme="minorHAnsi"/>
-          <w:sz w:val="24"/>
-          <w:szCs w:val="24"/>
-        </w:rPr>
-        <w:t xml:space="preserve">We have p=2, k=2, </w:t>
-      </w:r>
-      <w:proofErr w:type="spellStart"/>
-      <w:r>
-        <w:rPr>
-          <w:rFonts w:cstheme="minorHAnsi"/>
-          <w:sz w:val="24"/>
-          <w:szCs w:val="24"/>
-        </w:rPr>
-        <w:t>i</w:t>
-      </w:r>
-      <w:proofErr w:type="spellEnd"/>
-      <w:r>
-        <w:rPr>
-          <w:rFonts w:cstheme="minorHAnsi"/>
-          <w:sz w:val="24"/>
-          <w:szCs w:val="24"/>
-        </w:rPr>
-        <w:t xml:space="preserve">=5, so </w:t>
-      </w:r>
-      <w:r>
-        <w:rPr>
-          <w:rFonts w:cstheme="minorHAnsi"/>
-          <w:sz w:val="24"/>
-          <w:szCs w:val="24"/>
-        </w:rPr>
-        <w:t>common difference</w:t>
-      </w:r>
-      <w:r>
-        <w:rPr>
-          <w:rFonts w:cstheme="minorHAnsi"/>
-          <w:sz w:val="24"/>
-          <w:szCs w:val="24"/>
-        </w:rPr>
-        <w:t xml:space="preserve"> = 2</w:t>
-      </w:r>
-      <w:r>
-        <w:rPr>
-          <w:rFonts w:cstheme="minorHAnsi"/>
-          <w:sz w:val="24"/>
-          <w:szCs w:val="24"/>
-          <w:vertAlign w:val="superscript"/>
-        </w:rPr>
-        <w:t>3</w:t>
-      </w:r>
-      <w:r>
-        <w:rPr>
-          <w:rFonts w:cstheme="minorHAnsi"/>
-          <w:sz w:val="24"/>
-          <w:szCs w:val="24"/>
-        </w:rPr>
-        <w:t xml:space="preserve"> = 8.</w:t>
-      </w:r>
-    </w:p>
-    <w:p>
-      <w:pPr>
-        <w:spacing w:after="0"/>
-        <w:rPr>
-          <w:rFonts w:cstheme="minorHAnsi"/>
-          <w:sz w:val="24"/>
-          <w:szCs w:val="24"/>
-        </w:rPr>
-      </w:pPr>
-      <w:proofErr w:type="gramStart"/>
-      <w:r>
-        <w:rPr>
-          <w:rFonts w:cstheme="minorHAnsi"/>
-          <w:sz w:val="24"/>
-          <w:szCs w:val="24"/>
-        </w:rPr>
-        <w:t>So</w:t>
-      </w:r>
-      <w:proofErr w:type="gramEnd"/>
-      <w:r>
-        <w:rPr>
-          <w:rFonts w:cstheme="minorHAnsi"/>
-          <w:sz w:val="24"/>
-          <w:szCs w:val="24"/>
-        </w:rPr>
-        <w:t xml:space="preserve"> the 1</w:t>
-      </w:r>
-      <w:r>
-        <w:rPr>
-          <w:rFonts w:cstheme="minorHAnsi"/>
-          <w:sz w:val="24"/>
-          <w:szCs w:val="24"/>
-          <w:vertAlign w:val="superscript"/>
-        </w:rPr>
-        <w:t>st</w:t>
-      </w:r>
-      <w:r>
-        <w:rPr>
-          <w:rFonts w:cstheme="minorHAnsi"/>
-          <w:sz w:val="24"/>
-          <w:szCs w:val="24"/>
-        </w:rPr>
-        <w:t xml:space="preserve"> sequence of roots is 2, 10, 18, 26</w:t>
-      </w:r>
-    </w:p>
-    <w:p>
-      <w:pPr>
-        <w:spacing w:after="0"/>
-        <w:rPr>
-          <w:rFonts w:cstheme="minorHAnsi"/>
-          <w:sz w:val="24"/>
-          <w:szCs w:val="24"/>
-        </w:rPr>
-      </w:pPr>
-      <w:r>
-        <w:rPr>
-          <w:rFonts w:cstheme="minorHAnsi"/>
-          <w:sz w:val="24"/>
-          <w:szCs w:val="24"/>
-        </w:rPr>
-        <w:t>The second set of roots is 32-r</w:t>
-      </w:r>
-      <w:r>
-        <w:rPr>
-          <w:rFonts w:cstheme="minorHAnsi"/>
-          <w:sz w:val="24"/>
-          <w:szCs w:val="24"/>
-          <w:vertAlign w:val="subscript"/>
-        </w:rPr>
-        <w:t>1</w:t>
-      </w:r>
-      <w:r>
-        <w:rPr>
-          <w:rFonts w:cstheme="minorHAnsi"/>
-          <w:sz w:val="24"/>
-          <w:szCs w:val="24"/>
-        </w:rPr>
-        <w:t>, 32-r</w:t>
-      </w:r>
-      <w:r>
-        <w:rPr>
-          <w:rFonts w:cstheme="minorHAnsi"/>
-          <w:sz w:val="24"/>
-          <w:szCs w:val="24"/>
-          <w:vertAlign w:val="subscript"/>
-        </w:rPr>
-        <w:t>2</w:t>
-      </w:r>
-      <w:r>
-        <w:rPr>
-          <w:rFonts w:cstheme="minorHAnsi"/>
-          <w:sz w:val="24"/>
-          <w:szCs w:val="24"/>
-        </w:rPr>
-        <w:t>, …</w:t>
-      </w:r>
-      <w:r>
-        <w:rPr>
-          <w:rFonts w:cstheme="minorHAnsi"/>
-          <w:sz w:val="24"/>
-          <w:szCs w:val="24"/>
-        </w:rPr>
-        <w:t xml:space="preserve">etc. </w:t>
-      </w:r>
-      <w:r>
-        <w:rPr>
-          <w:rFonts w:cstheme="minorHAnsi"/>
+          <w:i/>
+          <w:sz w:val="24"/>
+          <w:szCs w:val="24"/>
+        </w:rPr>
+      </w:pPr>
+      <w:r>
+        <w:rPr>
+          <w:sz w:val="24"/>
+          <w:szCs w:val="24"/>
+        </w:rPr>
+        <w:t>M</w:t>
+      </w:r>
+      <w:r>
+        <w:rPr>
+          <w:sz w:val="24"/>
+          <w:szCs w:val="24"/>
+        </w:rPr>
+        <w:t>ultiplying each root by 1 we have the same</w:t>
+      </w:r>
+      <w:r>
+        <w:rPr>
           <w:sz w:val="24"/>
           <w:szCs w:val="24"/>
         </w:rPr>
         <w:t xml:space="preserve"> </w:t>
       </w:r>
-      <w:proofErr w:type="gramStart"/>
-      <w:r>
-        <w:rPr>
-          <w:rFonts w:cstheme="minorHAnsi"/>
-          <w:sz w:val="24"/>
-          <w:szCs w:val="24"/>
-        </w:rPr>
-        <w:t>i.e.</w:t>
-      </w:r>
-      <w:proofErr w:type="gramEnd"/>
-      <w:r>
-        <w:rPr>
-          <w:rFonts w:cstheme="minorHAnsi"/>
-          <w:sz w:val="24"/>
-          <w:szCs w:val="24"/>
-        </w:rPr>
-        <w:t xml:space="preserve"> 30, 22, 14, 6.</w:t>
-      </w:r>
-    </w:p>
-    <w:p>
-      <w:pPr>
-        <w:spacing w:after="0"/>
-        <w:rPr>
-          <w:sz w:val="24"/>
-          <w:szCs w:val="24"/>
-        </w:rPr>
-      </w:pPr>
-      <w:proofErr w:type="gramStart"/>
-      <w:r>
-        <w:rPr>
-          <w:rFonts w:cstheme="minorHAnsi"/>
-          <w:sz w:val="24"/>
-          <w:szCs w:val="24"/>
-        </w:rPr>
-        <w:t>So</w:t>
-      </w:r>
-      <w:proofErr w:type="gramEnd"/>
-      <w:r>
-        <w:rPr>
-          <w:rFonts w:cstheme="minorHAnsi"/>
-          <w:sz w:val="24"/>
-          <w:szCs w:val="24"/>
-        </w:rPr>
-        <w:t xml:space="preserve"> we have:</w:t>
+      <w:r>
+        <w:rPr>
+          <w:i/>
+          <w:sz w:val="24"/>
+          <w:szCs w:val="24"/>
+        </w:rPr>
+        <w:t>(Working by hand this step would be skipped)</w:t>
       </w:r>
     </w:p>
     <w:p>
@@ -9157,31 +9279,71 @@
           <w:sz w:val="24"/>
           <w:szCs w:val="24"/>
         </w:rPr>
-        <w:t>4, 32) = 2, 30, 10, 22, 18, 14, 26, 6,</w:t>
+        <w:t xml:space="preserve">4, 32) = </w:t>
+      </w:r>
+      <w:r>
+        <w:rPr>
+          <w:b/>
+          <w:i/>
+          <w:sz w:val="24"/>
+          <w:szCs w:val="24"/>
+        </w:rPr>
+        <w:t>2, 30, 10, 22, 18, 14, 26, 6</w:t>
+      </w:r>
+      <w:r>
+        <w:rPr>
+          <w:sz w:val="24"/>
+          <w:szCs w:val="24"/>
+        </w:rPr>
+        <w:t xml:space="preserve">.  More concisely: the roots are </w:t>
+      </w:r>
+      <w:r>
+        <w:rPr>
+          <w:rFonts w:cstheme="minorHAnsi"/>
+          <w:sz w:val="24"/>
+          <w:szCs w:val="24"/>
+        </w:rPr>
+        <w:t>±</w:t>
+      </w:r>
+      <w:r>
+        <w:rPr>
+          <w:sz w:val="24"/>
+          <w:szCs w:val="24"/>
+        </w:rPr>
+        <w:t>2 (mod 4)</w:t>
       </w:r>
     </w:p>
     <w:p>
       <w:pPr>
         <w:spacing w:after="0"/>
         <w:rPr>
-          <w:i/>
-          <w:sz w:val="24"/>
-          <w:szCs w:val="24"/>
-        </w:rPr>
-      </w:pPr>
-      <w:r>
-        <w:rPr>
-          <w:sz w:val="24"/>
-          <w:szCs w:val="24"/>
-        </w:rPr>
-        <w:t>M</w:t>
-      </w:r>
-      <w:r>
-        <w:rPr>
-          <w:sz w:val="24"/>
-          <w:szCs w:val="24"/>
-        </w:rPr>
-        <w:t>ultiplying each root by 1 we have the same</w:t>
+          <w:sz w:val="24"/>
+          <w:szCs w:val="24"/>
+        </w:rPr>
+      </w:pPr>
+    </w:p>
+    <w:p>
+      <w:pPr>
+        <w:spacing w:after="0"/>
+        <w:rPr>
+          <w:sz w:val="24"/>
+          <w:szCs w:val="24"/>
+        </w:rPr>
+      </w:pPr>
+      <w:r>
+        <w:rPr>
+          <w:sz w:val="24"/>
+          <w:szCs w:val="24"/>
+        </w:rPr>
+        <w:t>Use step 2(b) to solve x</w:t>
+      </w:r>
+      <w:r>
+        <w:rPr>
+          <w:sz w:val="24"/>
+          <w:szCs w:val="24"/>
+          <w:vertAlign w:val="superscript"/>
+        </w:rPr>
+        <w:t>2</w:t>
       </w:r>
       <w:r>
         <w:rPr>
@@ -9192,11 +9354,18 @@
       </w:r>
       <w:r>
         <w:rPr>
-          <w:i/>
-          <w:sz w:val="24"/>
-          <w:szCs w:val="24"/>
-        </w:rPr>
-        <w:t>(Working by hand this step would be skipped)</w:t>
+          <w:rFonts w:cstheme="minorHAnsi"/>
+          <w:sz w:val="24"/>
+          <w:szCs w:val="24"/>
+        </w:rPr>
+        <w:t>≡</w:t>
+      </w:r>
+      <w:r>
+        <w:rPr>
+          <w:sz w:val="24"/>
+          <w:szCs w:val="24"/>
+        </w:rPr>
+        <w:t xml:space="preserve"> 36 modulo 243.</w:t>
       </w:r>
     </w:p>
     <w:p>
@@ -9207,142 +9376,13 @@
           <w:szCs w:val="24"/>
         </w:rPr>
       </w:pPr>
-      <w:proofErr w:type="spellStart"/>
       <w:proofErr w:type="gramStart"/>
       <w:r>
         <w:rPr>
           <w:sz w:val="24"/>
           <w:szCs w:val="24"/>
         </w:rPr>
-        <w:t>modsqrt</w:t>
-      </w:r>
-      <w:proofErr w:type="spellEnd"/>
-      <w:r>
-        <w:rPr>
-          <w:sz w:val="24"/>
-          <w:szCs w:val="24"/>
-        </w:rPr>
-        <w:t>(</w:t>
-      </w:r>
-      <w:proofErr w:type="gramEnd"/>
-      <w:r>
-        <w:rPr>
-          <w:sz w:val="24"/>
-          <w:szCs w:val="24"/>
-        </w:rPr>
-        <w:t xml:space="preserve">4, 32) = </w:t>
-      </w:r>
-      <w:r>
-        <w:rPr>
-          <w:b/>
-          <w:i/>
-          <w:sz w:val="24"/>
-          <w:szCs w:val="24"/>
-        </w:rPr>
-        <w:t>2, 30, 10, 22, 18, 14, 26, 6</w:t>
-      </w:r>
-      <w:r>
-        <w:rPr>
-          <w:sz w:val="24"/>
-          <w:szCs w:val="24"/>
-        </w:rPr>
-        <w:t xml:space="preserve">.  More concisely: the roots are </w:t>
-      </w:r>
-      <w:r>
-        <w:rPr>
-          <w:rFonts w:cstheme="minorHAnsi"/>
-          <w:sz w:val="24"/>
-          <w:szCs w:val="24"/>
-        </w:rPr>
-        <w:t>±</w:t>
-      </w:r>
-      <w:r>
-        <w:rPr>
-          <w:sz w:val="24"/>
-          <w:szCs w:val="24"/>
-        </w:rPr>
-        <w:t>2 (mod 4)</w:t>
-      </w:r>
-    </w:p>
-    <w:p>
-      <w:pPr>
-        <w:spacing w:after="0"/>
-        <w:rPr>
-          <w:sz w:val="24"/>
-          <w:szCs w:val="24"/>
-        </w:rPr>
-      </w:pPr>
-    </w:p>
-    <w:p>
-      <w:pPr>
-        <w:spacing w:after="0"/>
-        <w:rPr>
-          <w:sz w:val="24"/>
-          <w:szCs w:val="24"/>
-        </w:rPr>
-      </w:pPr>
-      <w:r>
-        <w:rPr>
-          <w:sz w:val="24"/>
-          <w:szCs w:val="24"/>
-        </w:rPr>
-        <w:t>Use step 2(b) to solve x</w:t>
-      </w:r>
-      <w:r>
-        <w:rPr>
-          <w:sz w:val="24"/>
-          <w:szCs w:val="24"/>
-          <w:vertAlign w:val="superscript"/>
-        </w:rPr>
-        <w:t>2</w:t>
-      </w:r>
-      <w:r>
-        <w:rPr>
-          <w:sz w:val="24"/>
-          <w:szCs w:val="24"/>
-        </w:rPr>
-        <w:t xml:space="preserve"> </w:t>
-      </w:r>
-      <w:r>
-        <w:rPr>
-          <w:rFonts w:cstheme="minorHAnsi"/>
-          <w:sz w:val="24"/>
-          <w:szCs w:val="24"/>
-        </w:rPr>
-        <w:t>≡</w:t>
-      </w:r>
-      <w:r>
-        <w:rPr>
-          <w:sz w:val="24"/>
-          <w:szCs w:val="24"/>
-        </w:rPr>
-        <w:t xml:space="preserve"> 36 modulo 243.</w:t>
-      </w:r>
-    </w:p>
-    <w:p>
-      <w:pPr>
-        <w:spacing w:after="0"/>
-        <w:rPr>
-          <w:sz w:val="24"/>
-          <w:szCs w:val="24"/>
-        </w:rPr>
-      </w:pPr>
-      <w:proofErr w:type="spellStart"/>
-      <w:proofErr w:type="gramStart"/>
-      <w:r>
-        <w:rPr>
-          <w:sz w:val="24"/>
-          <w:szCs w:val="24"/>
-        </w:rPr>
-        <w:t>Gcd</w:t>
-      </w:r>
-      <w:proofErr w:type="spellEnd"/>
-      <w:r>
-        <w:rPr>
-          <w:sz w:val="24"/>
-          <w:szCs w:val="24"/>
-        </w:rPr>
-        <w:t>(</w:t>
+        <w:t>Gcd(</w:t>
       </w:r>
       <w:proofErr w:type="gramEnd"/>
       <w:r>

</xml_diff>